<commit_message>
Rewrite national games project with the student's text analysis
Rebuilds the paper in the first person from the collected data: 11
works (4 tales, 7 epics), 16 episodes. Horse games dominate the epics,
games act as tests in tales and show the hero's qualities in epics, and
all four asyk episodes start the plot. Episode summaries derived from
the student's quotes fill the empty columns (tuzetuler.json). Survey
results stay as placeholders until the Google Forms export arrives.

Co-Authored-By: Claude Opus 5.5 <noreply@anthropic.com>
Claude-Session: https://claude.ai/code/session_01GWp2V469ega9rMmDw4DHEN
</commit_message>
<xml_diff>
--- a/Zerde_Ulttyq_oiyndar/Zertteu_kundeligi.docx
+++ b/Zerde_Ulttyq_oiyndar/Zertteu_kundeligi.docx
@@ -100,23 +100,6 @@
         <w:t xml:space="preserve">Жобаның түрі: ☒ Жеке   ☐ Командалық</w:t>
       </w:r>
     </w:p>
-    <w:p>
-      <w:pPr>
-        <w:spacing w:after="120" w:before="60" w:line="276"/>
-        <w:jc w:val="both"/>
-      </w:pPr>
-      <w:r>
-        <w:rPr>
-          <w:rFonts w:ascii="Times New Roman" w:cs="Times New Roman" w:eastAsia="Times New Roman" w:hAnsi="Times New Roman"/>
-          <w:b w:val="false"/>
-          <w:bCs w:val="false"/>
-          <w:sz w:val="22"/>
-          <w:szCs w:val="22"/>
-          <w:highlight w:val="yellow"/>
-        </w:rPr>
-        <w:t xml:space="preserve">НҰСҚАУ (тапсыру алдында өшіріледі): Күнделікті жұмыс барысында толтырыңыз: нақты күнді, не істегеніңізді, не шыққанын және қандай қиындық болғанын өз сөзіңізбен жазыңыз. Төмендегі жолдар – жоспар бойынша дайындалған үлгі, оны шын орындалған жұмысқа сай өзгертіңіз.</w:t>
-      </w:r>
-    </w:p>
     <w:tbl>
       <w:tblPr>
         <w:tblW w:type="dxa" w:w="14570"/>
@@ -455,9 +438,8 @@
                 <w:bCs w:val="false"/>
                 <w:sz w:val="22"/>
                 <w:szCs w:val="22"/>
-                <w:highlight w:val="yellow"/>
-              </w:rPr>
-              <w:t xml:space="preserve">[күні]</w:t>
+              </w:rPr>
+              <w:t xml:space="preserve">2026 ж. қыркүйек</w:t>
             </w:r>
           </w:p>
         </w:tc>
@@ -592,9 +574,8 @@
                 <w:bCs w:val="false"/>
                 <w:sz w:val="22"/>
                 <w:szCs w:val="22"/>
-                <w:highlight w:val="yellow"/>
-              </w:rPr>
-              <w:t xml:space="preserve">[Қиындық болса жазыңыз]</w:t>
+              </w:rPr>
+              <w:t xml:space="preserve">Алғашында 15 шығарма алуды жоспарладым, кейін 11 шығармамен шектелдім</w:t>
             </w:r>
           </w:p>
         </w:tc>
@@ -700,9 +681,8 @@
                 <w:bCs w:val="false"/>
                 <w:sz w:val="22"/>
                 <w:szCs w:val="22"/>
-                <w:highlight w:val="yellow"/>
-              </w:rPr>
-              <w:t xml:space="preserve">[күні]</w:t>
+              </w:rPr>
+              <w:t xml:space="preserve">2026 ж. қыркүйек</w:t>
             </w:r>
           </w:p>
         </w:tc>
@@ -837,9 +817,8 @@
                 <w:bCs w:val="false"/>
                 <w:sz w:val="22"/>
                 <w:szCs w:val="22"/>
-                <w:highlight w:val="yellow"/>
-              </w:rPr>
-              <w:t xml:space="preserve">[Қиындық, өзгеріс]</w:t>
+              </w:rPr>
+              <w:t xml:space="preserve">–</w:t>
             </w:r>
           </w:p>
         </w:tc>
@@ -945,9 +924,8 @@
                 <w:bCs w:val="false"/>
                 <w:sz w:val="22"/>
                 <w:szCs w:val="22"/>
-                <w:highlight w:val="yellow"/>
-              </w:rPr>
-              <w:t xml:space="preserve">[күні]</w:t>
+              </w:rPr>
+              <w:t xml:space="preserve">2026 ж. қыркүйек</w:t>
             </w:r>
           </w:p>
         </w:tc>
@@ -981,7 +959,7 @@
                 <w:sz w:val="22"/>
                 <w:szCs w:val="22"/>
               </w:rPr>
-              <w:t xml:space="preserve">Ойындарды топтастыру</w:t>
+              <w:t xml:space="preserve">Ойындарды топтастыру және кодтау жүйесін жасау</w:t>
             </w:r>
           </w:p>
         </w:tc>
@@ -1015,7 +993,7 @@
                 <w:sz w:val="22"/>
                 <w:szCs w:val="22"/>
               </w:rPr>
-              <w:t xml:space="preserve">Зерттеуге 12 ойынды таңдап, оларды бес түрге бөлдім, әр ойынның ережесін жазып алдым</w:t>
+              <w:t xml:space="preserve">Жетекшім екеуміз 12 ойынды бес түрге бөлдік және ойынның сюжеттегі бес қызметін анықтадық</w:t>
             </w:r>
           </w:p>
         </w:tc>
@@ -1049,7 +1027,7 @@
                 <w:sz w:val="22"/>
                 <w:szCs w:val="22"/>
               </w:rPr>
-              <w:t xml:space="preserve">1-кесте, 1-сурет</w:t>
+              <w:t xml:space="preserve">1- және 2-кестелер, зерттеу кестесі</w:t>
             </w:r>
           </w:p>
         </w:tc>
@@ -1082,9 +1060,8 @@
                 <w:bCs w:val="false"/>
                 <w:sz w:val="22"/>
                 <w:szCs w:val="22"/>
-                <w:highlight w:val="yellow"/>
-              </w:rPr>
-              <w:t xml:space="preserve">[Қиындық, өзгеріс]</w:t>
+              </w:rPr>
+              <w:t xml:space="preserve">–</w:t>
             </w:r>
           </w:p>
         </w:tc>
@@ -1190,9 +1167,8 @@
                 <w:bCs w:val="false"/>
                 <w:sz w:val="22"/>
                 <w:szCs w:val="22"/>
-                <w:highlight w:val="yellow"/>
-              </w:rPr>
-              <w:t xml:space="preserve">[күні]</w:t>
+              </w:rPr>
+              <w:t xml:space="preserve">2026 ж. қыркүйек</w:t>
             </w:r>
           </w:p>
         </w:tc>
@@ -1226,7 +1202,7 @@
                 <w:sz w:val="22"/>
                 <w:szCs w:val="22"/>
               </w:rPr>
-              <w:t xml:space="preserve">Шығармаларды таңдау және кодтау жүйесін жасау</w:t>
+              <w:t xml:space="preserve">Ертегілерді оқу және талдау</w:t>
             </w:r>
           </w:p>
         </w:tc>
@@ -1260,7 +1236,7 @@
                 <w:sz w:val="22"/>
                 <w:szCs w:val="22"/>
               </w:rPr>
-              <w:t xml:space="preserve">15 шығарманы (8 ертегі, 7 жыр) таңдадым, ойынның сюжеттегі бес қызметін анықтадым</w:t>
+              <w:t xml:space="preserve">«Ер Төстік», «Керқұла атты Кендебай», «Алтын сақа», «Күн астындағы Күнікей қыз» ертегілерін оқып, ойын кездескен эпизодтарды кестеге жаздым</w:t>
             </w:r>
           </w:p>
         </w:tc>
@@ -1294,7 +1270,7 @@
                 <w:sz w:val="22"/>
                 <w:szCs w:val="22"/>
               </w:rPr>
-              <w:t xml:space="preserve">2- және 3-кестелер, зерттеу кестесі</w:t>
+              <w:t xml:space="preserve">Ертегілерде 7 эпизод; ең көбі «Ер Төстікте» (3)</w:t>
             </w:r>
           </w:p>
         </w:tc>
@@ -1327,9 +1303,8 @@
                 <w:bCs w:val="false"/>
                 <w:sz w:val="22"/>
                 <w:szCs w:val="22"/>
-                <w:highlight w:val="yellow"/>
-              </w:rPr>
-              <w:t xml:space="preserve">[Қиындық, өзгеріс]</w:t>
+              </w:rPr>
+              <w:t xml:space="preserve">«Күнікей қызда» тізімде жоқ ойын – жаяу бәйге кездесті, оны «Басқа» деп жаздым</w:t>
             </w:r>
           </w:p>
         </w:tc>
@@ -1435,9 +1410,8 @@
                 <w:bCs w:val="false"/>
                 <w:sz w:val="22"/>
                 <w:szCs w:val="22"/>
-                <w:highlight w:val="yellow"/>
-              </w:rPr>
-              <w:t xml:space="preserve">[күні]</w:t>
+              </w:rPr>
+              <w:t xml:space="preserve">2026 ж. қыркүйек</w:t>
             </w:r>
           </w:p>
         </w:tc>
@@ -1471,7 +1445,7 @@
                 <w:sz w:val="22"/>
                 <w:szCs w:val="22"/>
               </w:rPr>
-              <w:t xml:space="preserve">Ертегілерді оқу және талдау</w:t>
+              <w:t xml:space="preserve">Жырларды оқу және талдау</w:t>
             </w:r>
           </w:p>
         </w:tc>
@@ -1505,7 +1479,7 @@
                 <w:sz w:val="22"/>
                 <w:szCs w:val="22"/>
               </w:rPr>
-              <w:t xml:space="preserve">8 ертегіні оқып, ойын кездескен эпизодтарды кестеге жаздым</w:t>
+              <w:t xml:space="preserve">7 жырды кітаптан және сайттан оқып, ойын кездескен эпизодтарды кестеге жаздым</w:t>
             </w:r>
           </w:p>
         </w:tc>
@@ -1539,28 +1513,7 @@
                 <w:sz w:val="22"/>
                 <w:szCs w:val="22"/>
               </w:rPr>
-              <w:t xml:space="preserve">Ертегілерде </w:t>
-            </w:r>
-            <w:r>
-              <w:rPr>
-                <w:rFonts w:ascii="Times New Roman" w:cs="Times New Roman" w:eastAsia="Times New Roman" w:hAnsi="Times New Roman"/>
-                <w:b w:val="false"/>
-                <w:bCs w:val="false"/>
-                <w:sz w:val="22"/>
-                <w:szCs w:val="22"/>
-                <w:highlight w:val="yellow"/>
-              </w:rPr>
-              <w:t xml:space="preserve">[___]</w:t>
-            </w:r>
-            <w:r>
-              <w:rPr>
-                <w:rFonts w:ascii="Times New Roman" w:cs="Times New Roman" w:eastAsia="Times New Roman" w:hAnsi="Times New Roman"/>
-                <w:b w:val="false"/>
-                <w:bCs w:val="false"/>
-                <w:sz w:val="22"/>
-                <w:szCs w:val="22"/>
-              </w:rPr>
-              <w:t xml:space="preserve"> эпизод</w:t>
+              <w:t xml:space="preserve">Жырларда 9 эпизод</w:t>
             </w:r>
           </w:p>
         </w:tc>
@@ -1593,9 +1546,8 @@
                 <w:bCs w:val="false"/>
                 <w:sz w:val="22"/>
                 <w:szCs w:val="22"/>
-                <w:highlight w:val="yellow"/>
-              </w:rPr>
-              <w:t xml:space="preserve">[Мысалы: ойынның қызметін анықтау қиын болған эпизод]</w:t>
+              </w:rPr>
+              <w:t xml:space="preserve">Кейбір эпизодта ойынның қызметін анықтау қиын болды – жетекшім екеуміз бірге шештік</w:t>
             </w:r>
           </w:p>
         </w:tc>
@@ -1701,9 +1653,8 @@
                 <w:bCs w:val="false"/>
                 <w:sz w:val="22"/>
                 <w:szCs w:val="22"/>
-                <w:highlight w:val="yellow"/>
-              </w:rPr>
-              <w:t xml:space="preserve">[күні]</w:t>
+              </w:rPr>
+              <w:t xml:space="preserve">2026 ж. қыркүйек</w:t>
             </w:r>
           </w:p>
         </w:tc>
@@ -1737,7 +1688,7 @@
                 <w:sz w:val="22"/>
                 <w:szCs w:val="22"/>
               </w:rPr>
-              <w:t xml:space="preserve">Жырларды оқу және талдау</w:t>
+              <w:t xml:space="preserve">Сауалнамаға дайындық</w:t>
             </w:r>
           </w:p>
         </w:tc>
@@ -1771,7 +1722,7 @@
                 <w:sz w:val="22"/>
                 <w:szCs w:val="22"/>
               </w:rPr>
-              <w:t xml:space="preserve">7 жырды оқып, ойын кездескен эпизодтарды кестеге жаздым</w:t>
+              <w:t xml:space="preserve">Жетекшім екеуміз сауалнаманы Google Forms-та жасадық, ата-ана келісім парағын дайындадық</w:t>
             </w:r>
           </w:p>
         </w:tc>
@@ -1805,28 +1756,7 @@
                 <w:sz w:val="22"/>
                 <w:szCs w:val="22"/>
               </w:rPr>
-              <w:t xml:space="preserve">Жырларда </w:t>
-            </w:r>
-            <w:r>
-              <w:rPr>
-                <w:rFonts w:ascii="Times New Roman" w:cs="Times New Roman" w:eastAsia="Times New Roman" w:hAnsi="Times New Roman"/>
-                <w:b w:val="false"/>
-                <w:bCs w:val="false"/>
-                <w:sz w:val="22"/>
-                <w:szCs w:val="22"/>
-                <w:highlight w:val="yellow"/>
-              </w:rPr>
-              <w:t xml:space="preserve">[___]</w:t>
-            </w:r>
-            <w:r>
-              <w:rPr>
-                <w:rFonts w:ascii="Times New Roman" w:cs="Times New Roman" w:eastAsia="Times New Roman" w:hAnsi="Times New Roman"/>
-                <w:b w:val="false"/>
-                <w:bCs w:val="false"/>
-                <w:sz w:val="22"/>
-                <w:szCs w:val="22"/>
-              </w:rPr>
-              <w:t xml:space="preserve"> эпизод</w:t>
+              <w:t xml:space="preserve">Ә, Б қосымшалары</w:t>
             </w:r>
           </w:p>
         </w:tc>
@@ -1859,9 +1789,8 @@
                 <w:bCs w:val="false"/>
                 <w:sz w:val="22"/>
                 <w:szCs w:val="22"/>
-                <w:highlight w:val="yellow"/>
-              </w:rPr>
-              <w:t xml:space="preserve">[Қиындық, өзгеріс]</w:t>
+              </w:rPr>
+              <w:t xml:space="preserve">Формада есім мен электрондық пошта сұралмады</w:t>
             </w:r>
           </w:p>
         </w:tc>
@@ -1967,111 +1896,121 @@
                 <w:bCs w:val="false"/>
                 <w:sz w:val="22"/>
                 <w:szCs w:val="22"/>
+              </w:rPr>
+              <w:t xml:space="preserve">2026 ж. қазан</w:t>
+            </w:r>
+          </w:p>
+        </w:tc>
+        <w:tc>
+          <w:tcPr>
+            <w:tcW w:type="dxa" w:w="2476"/>
+            <w:tcBorders>
+              <w:top w:val="single" w:color="000000" w:sz="4"/>
+              <w:left w:val="single" w:color="000000" w:sz="4"/>
+              <w:bottom w:val="single" w:color="000000" w:sz="4"/>
+              <w:right w:val="single" w:color="000000" w:sz="4"/>
+            </w:tcBorders>
+            <w:tcMar>
+              <w:top w:type="dxa" w:w="40"/>
+              <w:left w:type="dxa" w:w="80"/>
+              <w:bottom w:type="dxa" w:w="40"/>
+              <w:right w:type="dxa" w:w="80"/>
+            </w:tcMar>
+            <w:vAlign w:val="center"/>
+          </w:tcPr>
+          <w:p>
+            <w:pPr>
+              <w:spacing w:line="240"/>
+              <w:jc w:val="left"/>
+            </w:pPr>
+            <w:r>
+              <w:rPr>
+                <w:rFonts w:ascii="Times New Roman" w:cs="Times New Roman" w:eastAsia="Times New Roman" w:hAnsi="Times New Roman"/>
+                <w:b w:val="false"/>
+                <w:bCs w:val="false"/>
+                <w:sz w:val="22"/>
+                <w:szCs w:val="22"/>
+              </w:rPr>
+              <w:t xml:space="preserve">Сауалнама жүргізу</w:t>
+            </w:r>
+          </w:p>
+        </w:tc>
+        <w:tc>
+          <w:tcPr>
+            <w:tcW w:type="dxa" w:w="3642"/>
+            <w:tcBorders>
+              <w:top w:val="single" w:color="000000" w:sz="4"/>
+              <w:left w:val="single" w:color="000000" w:sz="4"/>
+              <w:bottom w:val="single" w:color="000000" w:sz="4"/>
+              <w:right w:val="single" w:color="000000" w:sz="4"/>
+            </w:tcBorders>
+            <w:tcMar>
+              <w:top w:type="dxa" w:w="40"/>
+              <w:left w:type="dxa" w:w="80"/>
+              <w:bottom w:type="dxa" w:w="40"/>
+              <w:right w:type="dxa" w:w="80"/>
+            </w:tcMar>
+            <w:vAlign w:val="center"/>
+          </w:tcPr>
+          <w:p>
+            <w:pPr>
+              <w:spacing w:line="240"/>
+              <w:jc w:val="left"/>
+            </w:pPr>
+            <w:r>
+              <w:rPr>
+                <w:rFonts w:ascii="Times New Roman" w:cs="Times New Roman" w:eastAsia="Times New Roman" w:hAnsi="Times New Roman"/>
+                <w:b w:val="false"/>
+                <w:bCs w:val="false"/>
+                <w:sz w:val="22"/>
+                <w:szCs w:val="22"/>
+              </w:rPr>
+              <w:t xml:space="preserve">Сыныптастарым сауалнаманы толтырды, жауаптарды кестеге енгіздім</w:t>
+            </w:r>
+          </w:p>
+        </w:tc>
+        <w:tc>
+          <w:tcPr>
+            <w:tcW w:type="dxa" w:w="3059"/>
+            <w:tcBorders>
+              <w:top w:val="single" w:color="000000" w:sz="4"/>
+              <w:left w:val="single" w:color="000000" w:sz="4"/>
+              <w:bottom w:val="single" w:color="000000" w:sz="4"/>
+              <w:right w:val="single" w:color="000000" w:sz="4"/>
+            </w:tcBorders>
+            <w:tcMar>
+              <w:top w:type="dxa" w:w="40"/>
+              <w:left w:type="dxa" w:w="80"/>
+              <w:bottom w:type="dxa" w:w="40"/>
+              <w:right w:type="dxa" w:w="80"/>
+            </w:tcMar>
+            <w:vAlign w:val="center"/>
+          </w:tcPr>
+          <w:p>
+            <w:pPr>
+              <w:spacing w:line="240"/>
+              <w:jc w:val="left"/>
+            </w:pPr>
+            <w:r>
+              <w:rPr>
+                <w:rFonts w:ascii="Times New Roman" w:cs="Times New Roman" w:eastAsia="Times New Roman" w:hAnsi="Times New Roman"/>
+                <w:b w:val="false"/>
+                <w:bCs w:val="false"/>
+                <w:sz w:val="22"/>
+                <w:szCs w:val="22"/>
                 <w:highlight w:val="yellow"/>
               </w:rPr>
-              <w:t xml:space="preserve">[күні]</w:t>
-            </w:r>
-          </w:p>
-        </w:tc>
-        <w:tc>
-          <w:tcPr>
-            <w:tcW w:type="dxa" w:w="2476"/>
-            <w:tcBorders>
-              <w:top w:val="single" w:color="000000" w:sz="4"/>
-              <w:left w:val="single" w:color="000000" w:sz="4"/>
-              <w:bottom w:val="single" w:color="000000" w:sz="4"/>
-              <w:right w:val="single" w:color="000000" w:sz="4"/>
-            </w:tcBorders>
-            <w:tcMar>
-              <w:top w:type="dxa" w:w="40"/>
-              <w:left w:type="dxa" w:w="80"/>
-              <w:bottom w:type="dxa" w:w="40"/>
-              <w:right w:type="dxa" w:w="80"/>
-            </w:tcMar>
-            <w:vAlign w:val="center"/>
-          </w:tcPr>
-          <w:p>
-            <w:pPr>
-              <w:spacing w:line="240"/>
-              <w:jc w:val="left"/>
-            </w:pPr>
-            <w:r>
-              <w:rPr>
-                <w:rFonts w:ascii="Times New Roman" w:cs="Times New Roman" w:eastAsia="Times New Roman" w:hAnsi="Times New Roman"/>
-                <w:b w:val="false"/>
-                <w:bCs w:val="false"/>
-                <w:sz w:val="22"/>
-                <w:szCs w:val="22"/>
-              </w:rPr>
-              <w:t xml:space="preserve">Сауалнамаға дайындық</w:t>
-            </w:r>
-          </w:p>
-        </w:tc>
-        <w:tc>
-          <w:tcPr>
-            <w:tcW w:type="dxa" w:w="3642"/>
-            <w:tcBorders>
-              <w:top w:val="single" w:color="000000" w:sz="4"/>
-              <w:left w:val="single" w:color="000000" w:sz="4"/>
-              <w:bottom w:val="single" w:color="000000" w:sz="4"/>
-              <w:right w:val="single" w:color="000000" w:sz="4"/>
-            </w:tcBorders>
-            <w:tcMar>
-              <w:top w:type="dxa" w:w="40"/>
-              <w:left w:type="dxa" w:w="80"/>
-              <w:bottom w:type="dxa" w:w="40"/>
-              <w:right w:type="dxa" w:w="80"/>
-            </w:tcMar>
-            <w:vAlign w:val="center"/>
-          </w:tcPr>
-          <w:p>
-            <w:pPr>
-              <w:spacing w:line="240"/>
-              <w:jc w:val="left"/>
-            </w:pPr>
-            <w:r>
-              <w:rPr>
-                <w:rFonts w:ascii="Times New Roman" w:cs="Times New Roman" w:eastAsia="Times New Roman" w:hAnsi="Times New Roman"/>
-                <w:b w:val="false"/>
-                <w:bCs w:val="false"/>
-                <w:sz w:val="22"/>
-                <w:szCs w:val="22"/>
-              </w:rPr>
-              <w:t xml:space="preserve">Сауалнама парағы мен ата-ана келісім парағын дайындадым, жетекшіммен бекіттім, келісім парақтарын жинадым</w:t>
-            </w:r>
-          </w:p>
-        </w:tc>
-        <w:tc>
-          <w:tcPr>
-            <w:tcW w:type="dxa" w:w="3059"/>
-            <w:tcBorders>
-              <w:top w:val="single" w:color="000000" w:sz="4"/>
-              <w:left w:val="single" w:color="000000" w:sz="4"/>
-              <w:bottom w:val="single" w:color="000000" w:sz="4"/>
-              <w:right w:val="single" w:color="000000" w:sz="4"/>
-            </w:tcBorders>
-            <w:tcMar>
-              <w:top w:type="dxa" w:w="40"/>
-              <w:left w:type="dxa" w:w="80"/>
-              <w:bottom w:type="dxa" w:w="40"/>
-              <w:right w:type="dxa" w:w="80"/>
-            </w:tcMar>
-            <w:vAlign w:val="center"/>
-          </w:tcPr>
-          <w:p>
-            <w:pPr>
-              <w:spacing w:line="240"/>
-              <w:jc w:val="left"/>
-            </w:pPr>
-            <w:r>
-              <w:rPr>
-                <w:rFonts w:ascii="Times New Roman" w:cs="Times New Roman" w:eastAsia="Times New Roman" w:hAnsi="Times New Roman"/>
-                <w:b w:val="false"/>
-                <w:bCs w:val="false"/>
-                <w:sz w:val="22"/>
-                <w:szCs w:val="22"/>
-              </w:rPr>
-              <w:t xml:space="preserve">Ә, Б қосымшалары</w:t>
+              <w:t xml:space="preserve">[___]</w:t>
+            </w:r>
+            <w:r>
+              <w:rPr>
+                <w:rFonts w:ascii="Times New Roman" w:cs="Times New Roman" w:eastAsia="Times New Roman" w:hAnsi="Times New Roman"/>
+                <w:b w:val="false"/>
+                <w:bCs w:val="false"/>
+                <w:sz w:val="22"/>
+                <w:szCs w:val="22"/>
+              </w:rPr>
+              <w:t xml:space="preserve"> қатысушы</w:t>
             </w:r>
           </w:p>
         </w:tc>
@@ -2104,9 +2043,8 @@
                 <w:bCs w:val="false"/>
                 <w:sz w:val="22"/>
                 <w:szCs w:val="22"/>
-                <w:highlight w:val="yellow"/>
-              </w:rPr>
-              <w:t xml:space="preserve">[Неше ата-ана келісім берді?]</w:t>
+              </w:rPr>
+              <w:t xml:space="preserve">–</w:t>
             </w:r>
           </w:p>
         </w:tc>
@@ -2212,9 +2150,8 @@
                 <w:bCs w:val="false"/>
                 <w:sz w:val="22"/>
                 <w:szCs w:val="22"/>
-                <w:highlight w:val="yellow"/>
-              </w:rPr>
-              <w:t xml:space="preserve">[күні]</w:t>
+              </w:rPr>
+              <w:t xml:space="preserve">2026 ж. қазан</w:t>
             </w:r>
           </w:p>
         </w:tc>
@@ -2248,7 +2185,7 @@
                 <w:sz w:val="22"/>
                 <w:szCs w:val="22"/>
               </w:rPr>
-              <w:t xml:space="preserve">Сауалнама жүргізу</w:t>
+              <w:t xml:space="preserve">Нәтижелерді өңдеу</w:t>
             </w:r>
           </w:p>
         </w:tc>
@@ -2282,7 +2219,7 @@
                 <w:sz w:val="22"/>
                 <w:szCs w:val="22"/>
               </w:rPr>
-              <w:t xml:space="preserve">Сыныптастарым сауалнама толтырды, жауаптарды кодпен кестеге енгіздім</w:t>
+              <w:t xml:space="preserve">Кестелер мен диаграммаларды жасадым, ертегі мен жырды салыстырдым, болжамды тексердім</w:t>
             </w:r>
           </w:p>
         </w:tc>
@@ -2315,19 +2252,8 @@
                 <w:bCs w:val="false"/>
                 <w:sz w:val="22"/>
                 <w:szCs w:val="22"/>
-                <w:highlight w:val="yellow"/>
-              </w:rPr>
-              <w:t xml:space="preserve">[___]</w:t>
-            </w:r>
-            <w:r>
-              <w:rPr>
-                <w:rFonts w:ascii="Times New Roman" w:cs="Times New Roman" w:eastAsia="Times New Roman" w:hAnsi="Times New Roman"/>
-                <w:b w:val="false"/>
-                <w:bCs w:val="false"/>
-                <w:sz w:val="22"/>
-                <w:szCs w:val="22"/>
-              </w:rPr>
-              <w:t xml:space="preserve"> қатысушы</w:t>
+              </w:rPr>
+              <w:t xml:space="preserve">4–8-кестелер, 3–5-суреттер</w:t>
             </w:r>
           </w:p>
         </w:tc>
@@ -2360,9 +2286,8 @@
                 <w:bCs w:val="false"/>
                 <w:sz w:val="22"/>
                 <w:szCs w:val="22"/>
-                <w:highlight w:val="yellow"/>
-              </w:rPr>
-              <w:t xml:space="preserve">[Қиындық, өзгеріс]</w:t>
+              </w:rPr>
+              <w:t xml:space="preserve">Болжамым ішінара расталды: сынақ жырда емес, ертегіде жиі кездесті</w:t>
             </w:r>
           </w:p>
         </w:tc>
@@ -2468,9 +2393,8 @@
                 <w:bCs w:val="false"/>
                 <w:sz w:val="22"/>
                 <w:szCs w:val="22"/>
-                <w:highlight w:val="yellow"/>
-              </w:rPr>
-              <w:t xml:space="preserve">[күні]</w:t>
+              </w:rPr>
+              <w:t xml:space="preserve">2026 ж. қазан</w:t>
             </w:r>
           </w:p>
         </w:tc>
@@ -2504,7 +2428,7 @@
                 <w:sz w:val="22"/>
                 <w:szCs w:val="22"/>
               </w:rPr>
-              <w:t xml:space="preserve">Нәтижелерді өңдеу</w:t>
+              <w:t xml:space="preserve">«Ертегі-ойын» карточкаларын жасау</w:t>
             </w:r>
           </w:p>
         </w:tc>
@@ -2538,7 +2462,7 @@
                 <w:sz w:val="22"/>
                 <w:szCs w:val="22"/>
               </w:rPr>
-              <w:t xml:space="preserve">Кестелер мен диаграммаларды жасадым, ертегі мен жырды салыстырдым, болжамды тексердім</w:t>
+              <w:t xml:space="preserve">Әр ойынға ережесі мен шығармадағы эпизоды бар карточка жасадым</w:t>
             </w:r>
           </w:p>
         </w:tc>
@@ -2572,7 +2496,7 @@
                 <w:sz w:val="22"/>
                 <w:szCs w:val="22"/>
               </w:rPr>
-              <w:t xml:space="preserve">4–8-кестелер, 3–5-суреттер</w:t>
+              <w:t xml:space="preserve">12 карточка (В қосымшасы)</w:t>
             </w:r>
           </w:p>
         </w:tc>
@@ -2605,9 +2529,8 @@
                 <w:bCs w:val="false"/>
                 <w:sz w:val="22"/>
                 <w:szCs w:val="22"/>
-                <w:highlight w:val="yellow"/>
-              </w:rPr>
-              <w:t xml:space="preserve">[Болжам расталды ма?]</w:t>
+              </w:rPr>
+              <w:t xml:space="preserve">Шығармаларда кездеспеген 6 ойынның карточкасында осыны көрсеттім</w:t>
             </w:r>
           </w:p>
         </w:tc>
@@ -2713,9 +2636,8 @@
                 <w:bCs w:val="false"/>
                 <w:sz w:val="22"/>
                 <w:szCs w:val="22"/>
-                <w:highlight w:val="yellow"/>
-              </w:rPr>
-              <w:t xml:space="preserve">[күні]</w:t>
+              </w:rPr>
+              <w:t xml:space="preserve">2026 ж. қазан</w:t>
             </w:r>
           </w:p>
         </w:tc>
@@ -2749,7 +2671,7 @@
                 <w:sz w:val="22"/>
                 <w:szCs w:val="22"/>
               </w:rPr>
-              <w:t xml:space="preserve">«Ертегі-ойын» карточкаларын жасау</w:t>
+              <w:t xml:space="preserve">Жұмысты жазу және рефлексия</w:t>
             </w:r>
           </w:p>
         </w:tc>
@@ -2783,7 +2705,7 @@
                 <w:sz w:val="22"/>
                 <w:szCs w:val="22"/>
               </w:rPr>
-              <w:t xml:space="preserve">Әр ойынға ережесі мен ертегідегі эпизоды бар карточка жасадым</w:t>
+              <w:t xml:space="preserve">Кіріспе, бөлімдер, қорытынды және рефлексия жаздым, антиплагиаттан тексердім</w:t>
             </w:r>
           </w:p>
         </w:tc>
@@ -2817,7 +2739,7 @@
                 <w:sz w:val="22"/>
                 <w:szCs w:val="22"/>
               </w:rPr>
-              <w:t xml:space="preserve">12 карточка (В қосымшасы)</w:t>
+              <w:t xml:space="preserve">Жұмыс мәтіні, аннотация</w:t>
             </w:r>
           </w:p>
         </w:tc>
@@ -2850,9 +2772,8 @@
                 <w:bCs w:val="false"/>
                 <w:sz w:val="22"/>
                 <w:szCs w:val="22"/>
-                <w:highlight w:val="yellow"/>
-              </w:rPr>
-              <w:t xml:space="preserve">[Карточканы сыныптастарға көрсеттіңіз бе?]</w:t>
+              </w:rPr>
+              <w:t xml:space="preserve">–</w:t>
             </w:r>
           </w:p>
         </w:tc>
@@ -2958,9 +2879,8 @@
                 <w:bCs w:val="false"/>
                 <w:sz w:val="22"/>
                 <w:szCs w:val="22"/>
-                <w:highlight w:val="yellow"/>
-              </w:rPr>
-              <w:t xml:space="preserve">[күні]</w:t>
+              </w:rPr>
+              <w:t xml:space="preserve">2026 ж. қазан</w:t>
             </w:r>
           </w:p>
         </w:tc>
@@ -2994,7 +2914,7 @@
                 <w:sz w:val="22"/>
                 <w:szCs w:val="22"/>
               </w:rPr>
-              <w:t xml:space="preserve">Жұмысты жазу және рефлексия</w:t>
+              <w:t xml:space="preserve">Қорғауға дайындық</w:t>
             </w:r>
           </w:p>
         </w:tc>
@@ -3028,7 +2948,7 @@
                 <w:sz w:val="22"/>
                 <w:szCs w:val="22"/>
               </w:rPr>
-              <w:t xml:space="preserve">Кіріспе, бөлімдер, қорытынды және рефлексия жаздым, антиплагиаттан тексердім</w:t>
+              <w:t xml:space="preserve">Көрме стенді мен қорғау сөзін дайындадым, 5–7 минутқа сыятындай жаттықтым</w:t>
             </w:r>
           </w:p>
         </w:tc>
@@ -3062,7 +2982,7 @@
                 <w:sz w:val="22"/>
                 <w:szCs w:val="22"/>
               </w:rPr>
-              <w:t xml:space="preserve">Жұмыс мәтіні, аннотация</w:t>
+              <w:t xml:space="preserve">Көрме стенді, қорғау сөзі</w:t>
             </w:r>
           </w:p>
         </w:tc>
@@ -3095,254 +3015,8 @@
                 <w:bCs w:val="false"/>
                 <w:sz w:val="22"/>
                 <w:szCs w:val="22"/>
-                <w:highlight w:val="yellow"/>
-              </w:rPr>
-              <w:t xml:space="preserve">[Не жетілдірілді?]</w:t>
-            </w:r>
-          </w:p>
-        </w:tc>
-        <w:tc>
-          <w:tcPr>
-            <w:tcW w:type="dxa" w:w="878"/>
-            <w:tcBorders>
-              <w:top w:val="single" w:color="000000" w:sz="4"/>
-              <w:left w:val="single" w:color="000000" w:sz="4"/>
-              <w:bottom w:val="single" w:color="000000" w:sz="4"/>
-              <w:right w:val="single" w:color="000000" w:sz="4"/>
-            </w:tcBorders>
-            <w:tcMar>
-              <w:top w:type="dxa" w:w="40"/>
-              <w:left w:type="dxa" w:w="80"/>
-              <w:bottom w:type="dxa" w:w="40"/>
-              <w:right w:type="dxa" w:w="80"/>
-            </w:tcMar>
-            <w:vAlign w:val="center"/>
-          </w:tcPr>
-          <w:p>
-            <w:pPr>
-              <w:spacing w:line="240"/>
-              <w:jc w:val="center"/>
-            </w:pPr>
-            <w:r>
-              <w:rPr>
-                <w:rFonts w:ascii="Times New Roman" w:cs="Times New Roman" w:eastAsia="Times New Roman" w:hAnsi="Times New Roman"/>
-                <w:b w:val="false"/>
-                <w:bCs w:val="false"/>
-                <w:sz w:val="22"/>
-                <w:szCs w:val="22"/>
               </w:rPr>
               <w:t xml:space="preserve">–</w:t>
-            </w:r>
-          </w:p>
-        </w:tc>
-      </w:tr>
-      <w:tr>
-        <w:trPr>
-          <w:cantSplit/>
-        </w:trPr>
-        <w:tc>
-          <w:tcPr>
-            <w:tcW w:type="dxa" w:w="582"/>
-            <w:tcBorders>
-              <w:top w:val="single" w:color="000000" w:sz="4"/>
-              <w:left w:val="single" w:color="000000" w:sz="4"/>
-              <w:bottom w:val="single" w:color="000000" w:sz="4"/>
-              <w:right w:val="single" w:color="000000" w:sz="4"/>
-            </w:tcBorders>
-            <w:tcMar>
-              <w:top w:type="dxa" w:w="40"/>
-              <w:left w:type="dxa" w:w="80"/>
-              <w:bottom w:type="dxa" w:w="40"/>
-              <w:right w:type="dxa" w:w="80"/>
-            </w:tcMar>
-            <w:vAlign w:val="center"/>
-          </w:tcPr>
-          <w:p>
-            <w:pPr>
-              <w:spacing w:line="240"/>
-              <w:jc w:val="center"/>
-            </w:pPr>
-            <w:r>
-              <w:rPr>
-                <w:rFonts w:ascii="Times New Roman" w:cs="Times New Roman" w:eastAsia="Times New Roman" w:hAnsi="Times New Roman"/>
-                <w:b w:val="false"/>
-                <w:bCs w:val="false"/>
-                <w:sz w:val="22"/>
-                <w:szCs w:val="22"/>
-              </w:rPr>
-              <w:t xml:space="preserve">12</w:t>
-            </w:r>
-          </w:p>
-        </w:tc>
-        <w:tc>
-          <w:tcPr>
-            <w:tcW w:type="dxa" w:w="1311"/>
-            <w:tcBorders>
-              <w:top w:val="single" w:color="000000" w:sz="4"/>
-              <w:left w:val="single" w:color="000000" w:sz="4"/>
-              <w:bottom w:val="single" w:color="000000" w:sz="4"/>
-              <w:right w:val="single" w:color="000000" w:sz="4"/>
-            </w:tcBorders>
-            <w:tcMar>
-              <w:top w:type="dxa" w:w="40"/>
-              <w:left w:type="dxa" w:w="80"/>
-              <w:bottom w:type="dxa" w:w="40"/>
-              <w:right w:type="dxa" w:w="80"/>
-            </w:tcMar>
-            <w:vAlign w:val="center"/>
-          </w:tcPr>
-          <w:p>
-            <w:pPr>
-              <w:spacing w:line="240"/>
-              <w:jc w:val="left"/>
-            </w:pPr>
-            <w:r>
-              <w:rPr>
-                <w:rFonts w:ascii="Times New Roman" w:cs="Times New Roman" w:eastAsia="Times New Roman" w:hAnsi="Times New Roman"/>
-                <w:b w:val="false"/>
-                <w:bCs w:val="false"/>
-                <w:sz w:val="22"/>
-                <w:szCs w:val="22"/>
-                <w:highlight w:val="yellow"/>
-              </w:rPr>
-              <w:t xml:space="preserve">[күні]</w:t>
-            </w:r>
-          </w:p>
-        </w:tc>
-        <w:tc>
-          <w:tcPr>
-            <w:tcW w:type="dxa" w:w="2476"/>
-            <w:tcBorders>
-              <w:top w:val="single" w:color="000000" w:sz="4"/>
-              <w:left w:val="single" w:color="000000" w:sz="4"/>
-              <w:bottom w:val="single" w:color="000000" w:sz="4"/>
-              <w:right w:val="single" w:color="000000" w:sz="4"/>
-            </w:tcBorders>
-            <w:tcMar>
-              <w:top w:type="dxa" w:w="40"/>
-              <w:left w:type="dxa" w:w="80"/>
-              <w:bottom w:type="dxa" w:w="40"/>
-              <w:right w:type="dxa" w:w="80"/>
-            </w:tcMar>
-            <w:vAlign w:val="center"/>
-          </w:tcPr>
-          <w:p>
-            <w:pPr>
-              <w:spacing w:line="240"/>
-              <w:jc w:val="left"/>
-            </w:pPr>
-            <w:r>
-              <w:rPr>
-                <w:rFonts w:ascii="Times New Roman" w:cs="Times New Roman" w:eastAsia="Times New Roman" w:hAnsi="Times New Roman"/>
-                <w:b w:val="false"/>
-                <w:bCs w:val="false"/>
-                <w:sz w:val="22"/>
-                <w:szCs w:val="22"/>
-              </w:rPr>
-              <w:t xml:space="preserve">Қорғауға дайындық</w:t>
-            </w:r>
-          </w:p>
-        </w:tc>
-        <w:tc>
-          <w:tcPr>
-            <w:tcW w:type="dxa" w:w="3642"/>
-            <w:tcBorders>
-              <w:top w:val="single" w:color="000000" w:sz="4"/>
-              <w:left w:val="single" w:color="000000" w:sz="4"/>
-              <w:bottom w:val="single" w:color="000000" w:sz="4"/>
-              <w:right w:val="single" w:color="000000" w:sz="4"/>
-            </w:tcBorders>
-            <w:tcMar>
-              <w:top w:type="dxa" w:w="40"/>
-              <w:left w:type="dxa" w:w="80"/>
-              <w:bottom w:type="dxa" w:w="40"/>
-              <w:right w:type="dxa" w:w="80"/>
-            </w:tcMar>
-            <w:vAlign w:val="center"/>
-          </w:tcPr>
-          <w:p>
-            <w:pPr>
-              <w:spacing w:line="240"/>
-              <w:jc w:val="left"/>
-            </w:pPr>
-            <w:r>
-              <w:rPr>
-                <w:rFonts w:ascii="Times New Roman" w:cs="Times New Roman" w:eastAsia="Times New Roman" w:hAnsi="Times New Roman"/>
-                <w:b w:val="false"/>
-                <w:bCs w:val="false"/>
-                <w:sz w:val="22"/>
-                <w:szCs w:val="22"/>
-              </w:rPr>
-              <w:t xml:space="preserve">Көрме стенді мен қорғау сөзін дайындадым, 5–7 минутқа сыятындай жаттықтым</w:t>
-            </w:r>
-          </w:p>
-        </w:tc>
-        <w:tc>
-          <w:tcPr>
-            <w:tcW w:type="dxa" w:w="3059"/>
-            <w:tcBorders>
-              <w:top w:val="single" w:color="000000" w:sz="4"/>
-              <w:left w:val="single" w:color="000000" w:sz="4"/>
-              <w:bottom w:val="single" w:color="000000" w:sz="4"/>
-              <w:right w:val="single" w:color="000000" w:sz="4"/>
-            </w:tcBorders>
-            <w:tcMar>
-              <w:top w:type="dxa" w:w="40"/>
-              <w:left w:type="dxa" w:w="80"/>
-              <w:bottom w:type="dxa" w:w="40"/>
-              <w:right w:type="dxa" w:w="80"/>
-            </w:tcMar>
-            <w:vAlign w:val="center"/>
-          </w:tcPr>
-          <w:p>
-            <w:pPr>
-              <w:spacing w:line="240"/>
-              <w:jc w:val="left"/>
-            </w:pPr>
-            <w:r>
-              <w:rPr>
-                <w:rFonts w:ascii="Times New Roman" w:cs="Times New Roman" w:eastAsia="Times New Roman" w:hAnsi="Times New Roman"/>
-                <w:b w:val="false"/>
-                <w:bCs w:val="false"/>
-                <w:sz w:val="22"/>
-                <w:szCs w:val="22"/>
-              </w:rPr>
-              <w:t xml:space="preserve">Көрме стенді, қорғау сөзі</w:t>
-            </w:r>
-          </w:p>
-        </w:tc>
-        <w:tc>
-          <w:tcPr>
-            <w:tcW w:type="dxa" w:w="2622"/>
-            <w:tcBorders>
-              <w:top w:val="single" w:color="000000" w:sz="4"/>
-              <w:left w:val="single" w:color="000000" w:sz="4"/>
-              <w:bottom w:val="single" w:color="000000" w:sz="4"/>
-              <w:right w:val="single" w:color="000000" w:sz="4"/>
-            </w:tcBorders>
-            <w:tcMar>
-              <w:top w:type="dxa" w:w="40"/>
-              <w:left w:type="dxa" w:w="80"/>
-              <w:bottom w:type="dxa" w:w="40"/>
-              <w:right w:type="dxa" w:w="80"/>
-            </w:tcMar>
-            <w:vAlign w:val="center"/>
-          </w:tcPr>
-          <w:p>
-            <w:pPr>
-              <w:spacing w:line="240"/>
-              <w:jc w:val="left"/>
-            </w:pPr>
-            <w:r>
-              <w:rPr>
-                <w:rFonts w:ascii="Times New Roman" w:cs="Times New Roman" w:eastAsia="Times New Roman" w:hAnsi="Times New Roman"/>
-                <w:b w:val="false"/>
-                <w:bCs w:val="false"/>
-                <w:sz w:val="22"/>
-                <w:szCs w:val="22"/>
-                <w:highlight w:val="yellow"/>
-              </w:rPr>
-              <w:t xml:space="preserve">[Қиындықтар]</w:t>
             </w:r>
           </w:p>
         </w:tc>

</xml_diff>

<commit_message>
Add survey results and work editions to the national games project
Import 19 consented Google Forms responses into the research workbook,
write the survey section from them, and list the editions the student
read in table 3 and the references.

Co-Authored-By: Claude Opus 5.5 <noreply@anthropic.com>
Claude-Session: https://claude.ai/code/session_01GWp2V469ega9rMmDw4DHEN
</commit_message>
<xml_diff>
--- a/Zerde_Ulttyq_oiyndar/Zertteu_kundeligi.docx
+++ b/Zerde_Ulttyq_oiyndar/Zertteu_kundeligi.docx
@@ -1965,7 +1965,7 @@
                 <w:sz w:val="22"/>
                 <w:szCs w:val="22"/>
               </w:rPr>
-              <w:t xml:space="preserve">Сыныптастарым сауалнаманы толтырды, жауаптарды кестеге енгіздім</w:t>
+              <w:t xml:space="preserve">Сыныптастарым сауалнаманы толтырды (22 жауап, оның 3-еуі келісімсіз болғандықтан алынбады), жауаптарды кестеге аударып, санадым</w:t>
             </w:r>
           </w:p>
         </w:tc>
@@ -1998,19 +1998,8 @@
                 <w:bCs w:val="false"/>
                 <w:sz w:val="22"/>
                 <w:szCs w:val="22"/>
-                <w:highlight w:val="yellow"/>
-              </w:rPr>
-              <w:t xml:space="preserve">[___]</w:t>
-            </w:r>
-            <w:r>
-              <w:rPr>
-                <w:rFonts w:ascii="Times New Roman" w:cs="Times New Roman" w:eastAsia="Times New Roman" w:hAnsi="Times New Roman"/>
-                <w:b w:val="false"/>
-                <w:bCs w:val="false"/>
-                <w:sz w:val="22"/>
-                <w:szCs w:val="22"/>
-              </w:rPr>
-              <w:t xml:space="preserve"> қатысушы</w:t>
+              </w:rPr>
+              <w:t xml:space="preserve">19 қатысушы</w:t>
             </w:r>
           </w:p>
         </w:tc>

</xml_diff>